<commit_message>
Revise activity tiers, contribution review and unified six-point reward cap
</commit_message>
<xml_diff>
--- a/student-affairs-rules-20261018/团学组织加分细则_讨论稿.docx
+++ b/student-affairs-rules-20261018/团学组织加分细则_讨论稿.docx
@@ -12,7 +12,7 @@
     </w:p>
     <w:p>
       <w:r>
-        <w:t>原方案整理与修订建议｜讨论稿 V1.0｜2026年10月18日</w:t>
+        <w:t>原方案整理与修订建议｜讨论稿 V1.1（按补充意见修订）｜2026年10月18日</w:t>
       </w:r>
     </w:p>
     <w:p>
@@ -30,7 +30,7 @@
         <w:pStyle w:val="Heading1"/>
       </w:pPr>
       <w:r>
-        <w:t>一、总体判断与关键问题</w:t>
+        <w:t>一、本次确认的口径与待核准事项</w:t>
       </w:r>
     </w:p>
     <w:tbl>
@@ -132,7 +132,7 @@
               <w:rPr>
                 <w:sz w:val="18"/>
               </w:rPr>
-              <w:t>原方案1—2场计1分、3—4场计3分、5场及以上计5分，与每项重大活动1分不完全对应：2场少计1分，3场到4场不增分。应区分“上报批次”和“真实活动项目”，不得用5次批次为未参加对应项目的人补分。</w:t>
+              <w:t>保留用户确定的分档：有效参与1—2场计1分、3—4场计3分、5场及以上计5分，0场计0分。原来每个部门一学期办活动只能计一次操行分，此次拟扩大对持续履职的认可。分档与学校每次1分的上报形式如何衔接仍须确认，不以虚构活动或补造参与记录实现分档。</w:t>
             </w:r>
           </w:p>
         </w:tc>
@@ -163,7 +163,7 @@
               <w:rPr>
                 <w:sz w:val="18"/>
               </w:rPr>
-              <w:t>不建议主席团、部长、副部长、干事自动对应不同综测分值。建议按实际职责、交付成果区分工作贡献，用于内部评价和推优；同一合格重大活动的外部申报仍按学校统一标准。</w:t>
+              <w:t>不按职务固定设置不同分值。由承办部门部长根据实际履职审核工作人员资格；跨部门协助人员同样考察，未实际工作者不列入加分名单。优秀工作者推优须出具具体依据。</w:t>
             </w:r>
           </w:p>
         </w:tc>
@@ -225,7 +225,7 @@
               <w:rPr>
                 <w:sz w:val="18"/>
               </w:rPr>
-              <w:t>同一劳动不得重复申报；不同成果是否可跨操行、奖励、志愿时长累计，按学校规则确认。6分建议为个人在本细则覆盖的全部岗位累计上限，不是每部门各6分，也不限制比赛获奖等学校其他奖励项目。</w:t>
+              <w:t>同一劳动不得重复申报；不同成果是否可跨操行、奖励、志愿时长累计，按学校规则确认。本细则涉及的奖励分统一按个人每学期累计最多6分，不分部门、不分职务、不因兼任增加额度；同一工作不重复计算。比赛获奖等非本细则项目仍依学校规定，未据此擅自改设全校奖励总上限。</w:t>
             </w:r>
           </w:p>
         </w:tc>
@@ -738,7 +738,7 @@
               <w:rPr>
                 <w:sz w:val="18"/>
               </w:rPr>
-              <w:t>0场计0分；与1分/项衔接，职务差异尚无具体分值</w:t>
+              <w:t>0场计0分；与1分/项衔接，按实际履职审核，不按职务直接定分</w:t>
             </w:r>
           </w:p>
         </w:tc>
@@ -958,7 +958,7 @@
               <w:rPr>
                 <w:sz w:val="18"/>
               </w:rPr>
-              <w:t>本稿建议也纳入个人6分总上限，待确认</w:t>
+              <w:t>纳入个人每学期统一6分总上限</w:t>
             </w:r>
           </w:p>
         </w:tc>
@@ -1002,7 +1002,7 @@
               <w:rPr>
                 <w:sz w:val="18"/>
               </w:rPr>
-              <w:t>本稿建议也纳入个人6分总上限，待确认</w:t>
+              <w:t>纳入个人每学期统一6分总上限</w:t>
             </w:r>
           </w:p>
         </w:tc>
@@ -1046,7 +1046,7 @@
               <w:rPr>
                 <w:sz w:val="18"/>
               </w:rPr>
-              <w:t>跨组织兼任的累计规则待确认</w:t>
+              <w:t>跨组织、跨职务合并累计，每人每学期最多6分</w:t>
             </w:r>
           </w:p>
         </w:tc>
@@ -1062,7 +1062,7 @@
     </w:p>
     <w:p>
       <w:r>
-        <w:t>建议采用“项目认定＋逐项核验”的办法。先有真实活动及工作记录，再有加分名单；上报批次只用于行政汇总，不产生额外计分资格。学期约10场活动不等于10场都必须认定重大活动，也不要求凑足5项。</w:t>
+        <w:t>采用“活动认定＋实际履职审核＋学期分档”的方案。先认定实际参与资格，再按学期有效场次分档。上报批次只用于行政汇总，不产生额外参与记录；学校每次1分的申报方式与学期分档应由指导老师确认衔接。学期约10场实际活动不等于全部自动认定重大活动。</w:t>
       </w:r>
     </w:p>
     <w:tbl>
@@ -1195,7 +1195,7 @@
               <w:rPr>
                 <w:sz w:val="18"/>
               </w:rPr>
-              <w:t>承担具体组织工作并完成验收；仅报名、签到、观看或名义挂职不构成工作人员资格。宣传、主持、礼仪等工作是否属于可申报范围应事先明确。</w:t>
+              <w:t>由承办部门部长对工作人员进行考察，依据任务分工、实际执行和完成情况认定有效参与。其他部门人员来协助但未实际工作的，部长可不列入加分名单，并说明事实依据；仅报名、签到、观看或挂名不计有效场次。宣传、主持、礼仪的适用范围应事先明确。</w:t>
             </w:r>
           </w:p>
         </w:tc>
@@ -1213,7 +1213,7 @@
               <w:rPr>
                 <w:sz w:val="18"/>
               </w:rPr>
-              <w:t>建议计分</w:t>
+              <w:t>分档计分</w:t>
             </w:r>
           </w:p>
         </w:tc>
@@ -1226,7 +1226,7 @@
               <w:rPr>
                 <w:sz w:val="18"/>
               </w:rPr>
-              <w:t>在学校确认允许学院设置个人上限后：每个合格重大活动1操行分，个人学期最多5分，即min（合格项目数，5）。若学校另定上限，执行学校规则。</w:t>
+              <w:t>每人每学期有效参与0场计0分；1—2场计1操行分；3—4场计3操行分；5场及以上计5操行分。各档不叠加，只取达到的最高档。具体上报方法经老师确认后执行。</w:t>
             </w:r>
           </w:p>
         </w:tc>
@@ -1319,7 +1319,7 @@
               <w:rPr>
                 <w:sz w:val="18"/>
               </w:rPr>
-              <w:t>合格重大活动数</w:t>
+              <w:t>学期有效参与重大活动数</w:t>
             </w:r>
           </w:p>
         </w:tc>
@@ -1332,7 +1332,7 @@
               <w:rPr>
                 <w:sz w:val="18"/>
               </w:rPr>
-              <w:t>用户原分档</w:t>
+              <w:t>学期操行加分</w:t>
             </w:r>
           </w:p>
         </w:tc>
@@ -1345,7 +1345,7 @@
               <w:rPr>
                 <w:sz w:val="18"/>
               </w:rPr>
-              <w:t>建议逐项制（拟设5分上限）</w:t>
+              <w:t>说明</w:t>
             </w:r>
           </w:p>
         </w:tc>
@@ -1389,7 +1389,7 @@
               <w:rPr>
                 <w:sz w:val="18"/>
               </w:rPr>
-              <w:t>0</w:t>
+              <w:t>未形成有效参与记录不加分</w:t>
             </w:r>
           </w:p>
         </w:tc>
@@ -1407,6 +1407,19 @@
               <w:rPr>
                 <w:sz w:val="18"/>
               </w:rPr>
+              <w:t>1—2场</w:t>
+            </w:r>
+          </w:p>
+        </w:tc>
+        <w:tc>
+          <w:tcPr>
+            <w:tcW w:type="dxa" w:w="2770"/>
+          </w:tcPr>
+          <w:p>
+            <w:r>
+              <w:rPr>
+                <w:sz w:val="18"/>
+              </w:rPr>
               <w:t>1</w:t>
             </w:r>
           </w:p>
@@ -1420,20 +1433,7 @@
               <w:rPr>
                 <w:sz w:val="18"/>
               </w:rPr>
-              <w:t>1</w:t>
-            </w:r>
-          </w:p>
-        </w:tc>
-        <w:tc>
-          <w:tcPr>
-            <w:tcW w:type="dxa" w:w="2770"/>
-          </w:tcPr>
-          <w:p>
-            <w:r>
-              <w:rPr>
-                <w:sz w:val="18"/>
-              </w:rPr>
-              <w:t>1</w:t>
+              <w:t>按部长审核确认的有效场次统计</w:t>
             </w:r>
           </w:p>
         </w:tc>
@@ -1451,7 +1451,7 @@
               <w:rPr>
                 <w:sz w:val="18"/>
               </w:rPr>
-              <w:t>2</w:t>
+              <w:t>3—4场</w:t>
             </w:r>
           </w:p>
         </w:tc>
@@ -1464,7 +1464,7 @@
               <w:rPr>
                 <w:sz w:val="18"/>
               </w:rPr>
-              <w:t>1</w:t>
+              <w:t>3</w:t>
             </w:r>
           </w:p>
         </w:tc>
@@ -1477,7 +1477,7 @@
               <w:rPr>
                 <w:sz w:val="18"/>
               </w:rPr>
-              <w:t>2</w:t>
+              <w:t>只取本档，不与前档相加</w:t>
             </w:r>
           </w:p>
         </w:tc>
@@ -1495,7 +1495,7 @@
               <w:rPr>
                 <w:sz w:val="18"/>
               </w:rPr>
-              <w:t>3</w:t>
+              <w:t>5场及以上</w:t>
             </w:r>
           </w:p>
         </w:tc>
@@ -1508,7 +1508,7 @@
               <w:rPr>
                 <w:sz w:val="18"/>
               </w:rPr>
-              <w:t>3</w:t>
+              <w:t>5</w:t>
             </w:r>
           </w:p>
         </w:tc>
@@ -1521,95 +1521,7 @@
               <w:rPr>
                 <w:sz w:val="18"/>
               </w:rPr>
-              <w:t>3</w:t>
-            </w:r>
-          </w:p>
-        </w:tc>
-      </w:tr>
-      <w:tr>
-        <w:trPr>
-          <w:cantSplit/>
-        </w:trPr>
-        <w:tc>
-          <w:tcPr>
-            <w:tcW w:type="dxa" w:w="2770"/>
-          </w:tcPr>
-          <w:p>
-            <w:r>
-              <w:rPr>
-                <w:sz w:val="18"/>
-              </w:rPr>
-              <w:t>4</w:t>
-            </w:r>
-          </w:p>
-        </w:tc>
-        <w:tc>
-          <w:tcPr>
-            <w:tcW w:type="dxa" w:w="2770"/>
-          </w:tcPr>
-          <w:p>
-            <w:r>
-              <w:rPr>
-                <w:sz w:val="18"/>
-              </w:rPr>
-              <w:t>3</w:t>
-            </w:r>
-          </w:p>
-        </w:tc>
-        <w:tc>
-          <w:tcPr>
-            <w:tcW w:type="dxa" w:w="2770"/>
-          </w:tcPr>
-          <w:p>
-            <w:r>
-              <w:rPr>
-                <w:sz w:val="18"/>
-              </w:rPr>
-              <w:t>4</w:t>
-            </w:r>
-          </w:p>
-        </w:tc>
-      </w:tr>
-      <w:tr>
-        <w:trPr>
-          <w:cantSplit/>
-        </w:trPr>
-        <w:tc>
-          <w:tcPr>
-            <w:tcW w:type="dxa" w:w="2770"/>
-          </w:tcPr>
-          <w:p>
-            <w:r>
-              <w:rPr>
-                <w:sz w:val="18"/>
-              </w:rPr>
-              <w:t>5及以上</w:t>
-            </w:r>
-          </w:p>
-        </w:tc>
-        <w:tc>
-          <w:tcPr>
-            <w:tcW w:type="dxa" w:w="2770"/>
-          </w:tcPr>
-          <w:p>
-            <w:r>
-              <w:rPr>
-                <w:sz w:val="18"/>
-              </w:rPr>
-              <w:t>5</w:t>
-            </w:r>
-          </w:p>
-        </w:tc>
-        <w:tc>
-          <w:tcPr>
-            <w:tcW w:type="dxa" w:w="2770"/>
-          </w:tcPr>
-          <w:p>
-            <w:r>
-              <w:rPr>
-                <w:sz w:val="18"/>
-              </w:rPr>
-              <w:t>5</w:t>
+              <w:t>学期本项目最高5分</w:t>
             </w:r>
           </w:p>
         </w:tc>
@@ -1617,7 +1529,7 @@
     </w:tbl>
     <w:p>
       <w:r>
-        <w:t>如老师希望保留1／3／5档，可将其用作内部工作评价档位；未经学校确认，不直接换算为重大活动操行分。</w:t>
+        <w:t>部长审核的是实际履职资格，不因人员来自其他部门而降低标准或排除其正常申报。对不予认定的情况应记录未完成的具体任务及依据，允许本人提出复核；部长本人由指导老师或指定审核人复核。</w:t>
       </w:r>
     </w:p>
     <w:tbl>
@@ -2027,7 +1939,7 @@
               <w:rPr>
                 <w:sz w:val="18"/>
               </w:rPr>
-              <w:t>部长提交任务完成、工作质量、协作表现及服务记录；可拟用完成情况40%、质量30%、协作20%、日常履职10%的内部评分，具体标准另议。</w:t>
+              <w:t>部长须提交书面推优依据，列明候选人承担的任务、完成情况、工作质量、实际贡献及佐证材料；不得仅写“工作积极、表现优秀”等空泛评语。是否采用内部评分另议。</w:t>
             </w:r>
           </w:p>
         </w:tc>
@@ -3639,7 +3551,7 @@
     </w:p>
     <w:p>
       <w:r>
-        <w:t>建议操作口径（待确认）：按个人实际署名工作申报；多人共同承担同一岗位成果，先确认附件分值是个人额度还是作品岗位总额度，不自行全员乘算；同一成果同一岗位不重复申报，同一人兼岗能否累计按学校规定。区间分不得由部长事后随意选择。宣传部不另按一般“办活动2分”申报；奖励分按本稿建议累计最多6分。</w:t>
+        <w:t>建议操作口径（待确认）：按个人实际署名工作申报；多人共同承担同一岗位成果，先确认附件分值是个人额度还是作品岗位总额度，不自行全员乘算；同一成果同一岗位不重复申报，同一人兼岗能否累计按学校规定。区间分不得由部长事后随意选择。宣传部不另按一般“办活动2分”申报；奖励分按统一每人每学期累计最多6分。</w:t>
       </w:r>
     </w:p>
     <w:p>
@@ -4016,7 +3928,7 @@
         <w:pStyle w:val="Heading1"/>
       </w:pPr>
       <w:r>
-        <w:t>八、青志队及其他组织奖励分表（用户拟议，待核准）</w:t>
+        <w:t>八、青志队及其他组织奖励分表（分值拟议，统一上限已明确）</w:t>
       </w:r>
     </w:p>
     <w:tbl>
@@ -4084,7 +3996,7 @@
               <w:rPr>
                 <w:sz w:val="18"/>
               </w:rPr>
-              <w:t>学期上限建议</w:t>
+              <w:t>学期统一上限</w:t>
             </w:r>
           </w:p>
         </w:tc>
@@ -4255,7 +4167,7 @@
               <w:rPr>
                 <w:sz w:val="18"/>
               </w:rPr>
-              <w:t>建议同样累计6分，待确认</w:t>
+              <w:t>个人全部岗位奖励统一累计6分</w:t>
             </w:r>
           </w:p>
         </w:tc>
@@ -4312,7 +4224,7 @@
               <w:rPr>
                 <w:sz w:val="18"/>
               </w:rPr>
-              <w:t>建议同样累计6分，待确认</w:t>
+              <w:t>个人全部岗位奖励统一累计6分</w:t>
             </w:r>
           </w:p>
         </w:tc>
@@ -4320,7 +4232,7 @@
     </w:tbl>
     <w:p>
       <w:r>
-        <w:t>青志队自主承办志愿活动不自动进入学院重大活动名单。志愿时长与奖励分是否可同时登记应按学校制度，不一概允许或取消。主持、礼仪被取消的是本次拟取消的工作人员操行项目，其他独立获评荣誉是否可计分另按学校规则。</w:t>
+        <w:t>青志队自主承办志愿活动不自动进入学院重大活动名单。志愿时长与奖励分是否可同时登记应按学校制度，不一概允许或取消；同一工作不得重复计算奖励分。主持、礼仪被取消的是本次拟取消的工作人员操行项目，其他独立获评荣誉是否可计分另按学校规则。</w:t>
       </w:r>
     </w:p>
     <w:p>
@@ -4455,7 +4367,7 @@
               <w:rPr>
                 <w:sz w:val="18"/>
               </w:rPr>
-              <w:t>全部岗位性奖励合并适用个人6分拟议上限；超额记录可留作履职证明，不转移给他人或跨学期补报</w:t>
+              <w:t>全部岗位性奖励合并适用个人6分统一上限；超额记录可留作履职证明，不转移给他人或跨学期补报</w:t>
             </w:r>
           </w:p>
         </w:tc>
@@ -4631,7 +4543,7 @@
               <w:rPr>
                 <w:sz w:val="18"/>
               </w:rPr>
-              <w:t>参与4项合格重大活动</w:t>
+              <w:t>参与4场有效重大活动</w:t>
             </w:r>
           </w:p>
         </w:tc>
@@ -4644,7 +4556,7 @@
               <w:rPr>
                 <w:sz w:val="18"/>
               </w:rPr>
-              <w:t>原分档3操行分；建议逐项制4操行分</w:t>
+              <w:t>按确定的分档计3操行分</w:t>
             </w:r>
           </w:p>
         </w:tc>
@@ -4776,7 +4688,7 @@
               <w:rPr>
                 <w:sz w:val="18"/>
               </w:rPr>
-              <w:t>原始8分，按拟议上限计6奖励分</w:t>
+              <w:t>原始8分，按统一上限计6奖励分</w:t>
             </w:r>
           </w:p>
         </w:tc>
@@ -4820,7 +4732,7 @@
               <w:rPr>
                 <w:sz w:val="18"/>
               </w:rPr>
-              <w:t>3×2＋1＝7分，按建议累计上限计6分</w:t>
+              <w:t>3×2＋1＝7分，按统一个人累计上限计6分</w:t>
             </w:r>
           </w:p>
         </w:tc>
@@ -4833,7 +4745,7 @@
               <w:rPr>
                 <w:sz w:val="18"/>
               </w:rPr>
-              <w:t>主持礼仪纳入统一上限获确认</w:t>
+              <w:t>主持与礼仪跨岗位合并累计</w:t>
             </w:r>
           </w:p>
         </w:tc>
@@ -4854,12 +4766,12 @@
     </w:p>
     <w:p>
       <w:r>
-        <w:t>□ 重大活动由谁认定，哪些工作岗位可申报；是否允许每人每学期最多5分；5次是批次上限还是项目上限。</w:t>
+        <w:t>□ 重大活动由谁认定、哪些工作岗位可申报；分档最高5分的上报依据；5次是批次上限还是项目上限。</w:t>
       </w:r>
     </w:p>
     <w:p>
       <w:r>
-        <w:t>□ 能否用真实合格项目数逐项计分，替换1／3／5分档；约10场实际活动中哪些确属重大活动。</w:t>
+        <w:t>□ 保留1／3／5分档，确认学校系统如何合规上报；约10场实际活动中哪些确属重大活动。</w:t>
       </w:r>
     </w:p>
     <w:p>
@@ -4879,7 +4791,7 @@
     </w:p>
     <w:p>
       <w:r>
-        <w:t>□ 个人6分是否覆盖全部下属队伍、兼任岗位；与学校其他奖励项目分开核算；各分项跨类别累计规则。</w:t>
+        <w:t>□ 本细则个人奖励分统一6分上限已覆盖全部下属队伍与兼任岗位，不分部门职务；需确认与学校其他奖励项目的衔接和跨类别累计规则。</w:t>
       </w:r>
     </w:p>
     <w:p>

</xml_diff>

<commit_message>
Separate four reward tables and exempt subordinate teams from department cap
</commit_message>
<xml_diff>
--- a/student-affairs-rules-20261018/团学组织加分细则_讨论稿.docx
+++ b/student-affairs-rules-20261018/团学组织加分细则_讨论稿.docx
@@ -12,7 +12,7 @@
     </w:p>
     <w:p>
       <w:r>
-        <w:t>原方案整理与修订建议｜讨论稿 V1.1（按补充意见修订）｜2026年10月18日</w:t>
+        <w:t>原方案整理与修订建议｜讨论稿 V1.2（四表分类版）｜2026年10月18日</w:t>
       </w:r>
     </w:p>
     <w:p>
@@ -225,7 +225,7 @@
               <w:rPr>
                 <w:sz w:val="18"/>
               </w:rPr>
-              <w:t>同一劳动不得重复申报；不同成果是否可跨操行、奖励、志愿时长累计，按学校规则确认。本细则涉及的奖励分统一按个人每学期累计最多6分，不分部门、不分职务、不因兼任增加额度；同一工作不重复计算。比赛获奖等非本细则项目仍依学校规定，未据此擅自改设全校奖励总上限。</w:t>
+              <w:t>同一劳动不得重复申报；不同成果是否可跨操行、奖励、志愿时长累计，按学校规则确认。宣传部、学习部及其他部门（含青志队）的部门奖励分合并按个人每学期最多6分，不分部门、不分职务；主持队、礼仪队等下属二级队伍奖励分单独据实累计，不受6分上限限制、不占用部门6分额度。同一工作不重复计算。比赛获奖等非本细则项目仍依学校规定，未据此擅自改设全校奖励总上限。</w:t>
             </w:r>
           </w:p>
         </w:tc>
@@ -958,7 +958,7 @@
               <w:rPr>
                 <w:sz w:val="18"/>
               </w:rPr>
-              <w:t>纳入个人每学期统一6分总上限</w:t>
+              <w:t>二级队伍单独据实累计，不受部门6分上限限制</w:t>
             </w:r>
           </w:p>
         </w:tc>
@@ -1002,7 +1002,7 @@
               <w:rPr>
                 <w:sz w:val="18"/>
               </w:rPr>
-              <w:t>纳入个人每学期统一6分总上限</w:t>
+              <w:t>二级队伍单独据实累计，不受部门6分上限限制</w:t>
             </w:r>
           </w:p>
         </w:tc>
@@ -1046,7 +1046,7 @@
               <w:rPr>
                 <w:sz w:val="18"/>
               </w:rPr>
-              <w:t>跨组织、跨职务合并累计，每人每学期最多6分</w:t>
+              <w:t>部门岗位跨组织、跨职务合并累计6分；二级队伍奖励另计，不封顶</w:t>
             </w:r>
           </w:p>
         </w:tc>
@@ -1981,7 +1981,7 @@
         <w:pStyle w:val="Heading1"/>
       </w:pPr>
       <w:r>
-        <w:t>六、宣传部奖励分表（附件校级标准减半）</w:t>
+        <w:t>六、宣传部奖励分表（第一表，附件校级标准减半）</w:t>
       </w:r>
     </w:p>
     <w:p>
@@ -3546,12 +3546,12 @@
     </w:tbl>
     <w:p>
       <w:r>
-        <w:t>附件另列“组织其他工作人员（参与统计加分细则等工作）按学期每学期加5分”。其学院适用值是否同样减半为2.5分、能否与成果分并计、是否纳入拟定6分上限，需要学校确认；本稿不自动给所有宣传部成员加2.5分或5分。</w:t>
+        <w:t>附件另列“组织其他工作人员（参与统计加分细则等工作）按学期每学期加5分”。其学院适用值是否同样减半为2.5分、能否与成果分并计、其与成果分的具体适用口径需要学校确认；宣传部部门奖励统一纳入6分上限；本稿不自动给所有宣传部成员加2.5分或5分。</w:t>
       </w:r>
     </w:p>
     <w:p>
       <w:r>
-        <w:t>建议操作口径（待确认）：按个人实际署名工作申报；多人共同承担同一岗位成果，先确认附件分值是个人额度还是作品岗位总额度，不自行全员乘算；同一成果同一岗位不重复申报，同一人兼岗能否累计按学校规定。区间分不得由部长事后随意选择。宣传部不另按一般“办活动2分”申报；奖励分按统一每人每学期累计最多6分。</w:t>
+        <w:t>建议操作口径（待确认）：按个人实际署名工作申报；多人共同承担同一岗位成果，先确认附件分值是个人额度还是作品岗位总额度，不自行全员乘算；同一成果同一岗位不重复申报，同一人兼岗能否累计按学校规定。区间分不得由部长事后随意选择。宣传部不另按一般“办活动2分”申报；与学习部及其他部门岗位奖励合并，每人每学期最多6分；二级队伍奖励单独据实累计、不占该额度。</w:t>
       </w:r>
     </w:p>
     <w:p>
@@ -3559,7 +3559,7 @@
         <w:pStyle w:val="Heading1"/>
       </w:pPr>
       <w:r>
-        <w:t>七、学习部奖励分表（用户拟议，待核准）</w:t>
+        <w:t>七、学习部奖励分表（第二表）</w:t>
       </w:r>
     </w:p>
     <w:tbl>
@@ -3899,7 +3899,7 @@
               <w:rPr>
                 <w:sz w:val="18"/>
               </w:rPr>
-              <w:t>上述合计并与其他本细则岗位奖励累计</w:t>
+              <w:t>上述合计并与宣传部及其他部门奖励累计；二级队伍奖励另计</w:t>
             </w:r>
           </w:p>
         </w:tc>
@@ -3928,7 +3928,12 @@
         <w:pStyle w:val="Heading1"/>
       </w:pPr>
       <w:r>
-        <w:t>八、青志队及其他组织奖励分表（分值拟议，统一上限已明确）</w:t>
+        <w:t>八、其他所有部门奖励分表（第三表）</w:t>
+      </w:r>
+    </w:p>
+    <w:p>
+      <w:r>
+        <w:t>适用对象：除宣传部、学习部外的团委、学生会各部门及青志队各部门。青志队在本表单列工作事项，不另设第五张计分表。</w:t>
       </w:r>
     </w:p>
     <w:tbl>
@@ -3938,10 +3943,11 @@
         <w:tblLook w:firstColumn="1" w:firstRow="1" w:lastColumn="0" w:lastRow="0" w:noHBand="0" w:noVBand="1" w:val="04A0"/>
       </w:tblPr>
       <w:tblGrid>
-        <w:gridCol w:w="2077"/>
-        <w:gridCol w:w="2077"/>
-        <w:gridCol w:w="2077"/>
-        <w:gridCol w:w="2077"/>
+        <w:gridCol w:w="1662"/>
+        <w:gridCol w:w="1662"/>
+        <w:gridCol w:w="1662"/>
+        <w:gridCol w:w="1662"/>
+        <w:gridCol w:w="1662"/>
       </w:tblGrid>
       <w:tr>
         <w:trPr>
@@ -3950,53 +3956,66 @@
         </w:trPr>
         <w:tc>
           <w:tcPr>
-            <w:tcW w:type="dxa" w:w="2077"/>
-          </w:tcPr>
-          <w:p>
-            <w:r>
-              <w:rPr>
-                <w:sz w:val="18"/>
-              </w:rPr>
-              <w:t>组织／事项</w:t>
-            </w:r>
-          </w:p>
-        </w:tc>
-        <w:tc>
-          <w:tcPr>
-            <w:tcW w:type="dxa" w:w="2077"/>
-          </w:tcPr>
-          <w:p>
-            <w:r>
-              <w:rPr>
-                <w:sz w:val="18"/>
-              </w:rPr>
-              <w:t>原拟标准</w:t>
-            </w:r>
-          </w:p>
-        </w:tc>
-        <w:tc>
-          <w:tcPr>
-            <w:tcW w:type="dxa" w:w="2077"/>
-          </w:tcPr>
-          <w:p>
-            <w:r>
-              <w:rPr>
-                <w:sz w:val="18"/>
-              </w:rPr>
-              <w:t>建议认定条件</w:t>
-            </w:r>
-          </w:p>
-        </w:tc>
-        <w:tc>
-          <w:tcPr>
-            <w:tcW w:type="dxa" w:w="2077"/>
-          </w:tcPr>
-          <w:p>
-            <w:r>
-              <w:rPr>
-                <w:sz w:val="18"/>
-              </w:rPr>
-              <w:t>学期统一上限</w:t>
+            <w:tcW w:type="dxa" w:w="1662"/>
+          </w:tcPr>
+          <w:p>
+            <w:r>
+              <w:rPr>
+                <w:sz w:val="18"/>
+              </w:rPr>
+              <w:t>适用部门</w:t>
+            </w:r>
+          </w:p>
+        </w:tc>
+        <w:tc>
+          <w:tcPr>
+            <w:tcW w:type="dxa" w:w="1662"/>
+          </w:tcPr>
+          <w:p>
+            <w:r>
+              <w:rPr>
+                <w:sz w:val="18"/>
+              </w:rPr>
+              <w:t>工作事项</w:t>
+            </w:r>
+          </w:p>
+        </w:tc>
+        <w:tc>
+          <w:tcPr>
+            <w:tcW w:type="dxa" w:w="1662"/>
+          </w:tcPr>
+          <w:p>
+            <w:r>
+              <w:rPr>
+                <w:sz w:val="18"/>
+              </w:rPr>
+              <w:t>奖励分标准</w:t>
+            </w:r>
+          </w:p>
+        </w:tc>
+        <w:tc>
+          <w:tcPr>
+            <w:tcW w:type="dxa" w:w="1662"/>
+          </w:tcPr>
+          <w:p>
+            <w:r>
+              <w:rPr>
+                <w:sz w:val="18"/>
+              </w:rPr>
+              <w:t>认定条件</w:t>
+            </w:r>
+          </w:p>
+        </w:tc>
+        <w:tc>
+          <w:tcPr>
+            <w:tcW w:type="dxa" w:w="1662"/>
+          </w:tcPr>
+          <w:p>
+            <w:r>
+              <w:rPr>
+                <w:sz w:val="18"/>
+              </w:rPr>
+              <w:t>上限与去重</w:t>
             </w:r>
           </w:p>
         </w:tc>
@@ -4007,20 +4026,33 @@
         </w:trPr>
         <w:tc>
           <w:tcPr>
-            <w:tcW w:type="dxa" w:w="2077"/>
-          </w:tcPr>
-          <w:p>
-            <w:r>
-              <w:rPr>
-                <w:sz w:val="18"/>
-              </w:rPr>
-              <w:t>青志队自主承办志愿活动</w:t>
-            </w:r>
-          </w:p>
-        </w:tc>
-        <w:tc>
-          <w:tcPr>
-            <w:tcW w:type="dxa" w:w="2077"/>
+            <w:tcW w:type="dxa" w:w="1662"/>
+          </w:tcPr>
+          <w:p>
+            <w:r>
+              <w:rPr>
+                <w:sz w:val="18"/>
+              </w:rPr>
+              <w:t>其他团委、学生会部门</w:t>
+            </w:r>
+          </w:p>
+        </w:tc>
+        <w:tc>
+          <w:tcPr>
+            <w:tcW w:type="dxa" w:w="1662"/>
+          </w:tcPr>
+          <w:p>
+            <w:r>
+              <w:rPr>
+                <w:sz w:val="18"/>
+              </w:rPr>
+              <w:t>组织承办学院活动</w:t>
+            </w:r>
+          </w:p>
+        </w:tc>
+        <w:tc>
+          <w:tcPr>
+            <w:tcW w:type="dxa" w:w="1662"/>
           </w:tcPr>
           <w:p>
             <w:r>
@@ -4033,27 +4065,27 @@
         </w:tc>
         <w:tc>
           <w:tcPr>
-            <w:tcW w:type="dxa" w:w="2077"/>
-          </w:tcPr>
-          <w:p>
-            <w:r>
-              <w:rPr>
-                <w:sz w:val="18"/>
-              </w:rPr>
-              <w:t>个人承担实质筹备、组织或执行工作并完成验收；仅参加志愿服务不自动按承办人员计分</w:t>
-            </w:r>
-          </w:p>
-        </w:tc>
-        <w:tc>
-          <w:tcPr>
-            <w:tcW w:type="dxa" w:w="2077"/>
-          </w:tcPr>
-          <w:p>
-            <w:r>
-              <w:rPr>
-                <w:sz w:val="18"/>
-              </w:rPr>
-              <w:t>个人本细则累计6分</w:t>
+            <w:tcW w:type="dxa" w:w="1662"/>
+          </w:tcPr>
+          <w:p>
+            <w:r>
+              <w:rPr>
+                <w:sz w:val="18"/>
+              </w:rPr>
+              <w:t>部长根据任务分工、实际工作和成果审核；仅挂名或未实际工作者不计分</w:t>
+            </w:r>
+          </w:p>
+        </w:tc>
+        <w:tc>
+          <w:tcPr>
+            <w:tcW w:type="dxa" w:w="1662"/>
+          </w:tcPr>
+          <w:p>
+            <w:r>
+              <w:rPr>
+                <w:sz w:val="18"/>
+              </w:rPr>
+              <w:t>与宣传部、学习部等部门奖励跨部门合并，每人每学期最多6分；同一工作不重复计算</w:t>
             </w:r>
           </w:p>
         </w:tc>
@@ -4064,20 +4096,33 @@
         </w:trPr>
         <w:tc>
           <w:tcPr>
-            <w:tcW w:type="dxa" w:w="2077"/>
-          </w:tcPr>
-          <w:p>
-            <w:r>
-              <w:rPr>
-                <w:sz w:val="18"/>
-              </w:rPr>
-              <w:t>其他团委、学生会部门办活动</w:t>
-            </w:r>
-          </w:p>
-        </w:tc>
-        <w:tc>
-          <w:tcPr>
-            <w:tcW w:type="dxa" w:w="2077"/>
+            <w:tcW w:type="dxa" w:w="1662"/>
+          </w:tcPr>
+          <w:p>
+            <w:r>
+              <w:rPr>
+                <w:sz w:val="18"/>
+              </w:rPr>
+              <w:t>青志队各部门</w:t>
+            </w:r>
+          </w:p>
+        </w:tc>
+        <w:tc>
+          <w:tcPr>
+            <w:tcW w:type="dxa" w:w="1662"/>
+          </w:tcPr>
+          <w:p>
+            <w:r>
+              <w:rPr>
+                <w:sz w:val="18"/>
+              </w:rPr>
+              <w:t>自主承办志愿活动</w:t>
+            </w:r>
+          </w:p>
+        </w:tc>
+        <w:tc>
+          <w:tcPr>
+            <w:tcW w:type="dxa" w:w="1662"/>
           </w:tcPr>
           <w:p>
             <w:r>
@@ -4090,141 +4135,27 @@
         </w:tc>
         <w:tc>
           <w:tcPr>
-            <w:tcW w:type="dxa" w:w="2077"/>
-          </w:tcPr>
-          <w:p>
-            <w:r>
-              <w:rPr>
-                <w:sz w:val="18"/>
-              </w:rPr>
-              <w:t>仅实际承担并完成组织任务的人员；活动编号、岗位任务、成果、验收记录齐全</w:t>
-            </w:r>
-          </w:p>
-        </w:tc>
-        <w:tc>
-          <w:tcPr>
-            <w:tcW w:type="dxa" w:w="2077"/>
-          </w:tcPr>
-          <w:p>
-            <w:r>
-              <w:rPr>
-                <w:sz w:val="18"/>
-              </w:rPr>
-              <w:t>个人本细则累计6分</w:t>
-            </w:r>
-          </w:p>
-        </w:tc>
-      </w:tr>
-      <w:tr>
-        <w:trPr>
-          <w:cantSplit/>
-        </w:trPr>
-        <w:tc>
-          <w:tcPr>
-            <w:tcW w:type="dxa" w:w="2077"/>
-          </w:tcPr>
-          <w:p>
-            <w:r>
-              <w:rPr>
-                <w:sz w:val="18"/>
-              </w:rPr>
-              <w:t>主持队主持</w:t>
-            </w:r>
-          </w:p>
-        </w:tc>
-        <w:tc>
-          <w:tcPr>
-            <w:tcW w:type="dxa" w:w="2077"/>
-          </w:tcPr>
-          <w:p>
-            <w:r>
-              <w:rPr>
-                <w:sz w:val="18"/>
-              </w:rPr>
-              <w:t>3分/次；取消原工作人员操行分</w:t>
-            </w:r>
-          </w:p>
-        </w:tc>
-        <w:tc>
-          <w:tcPr>
-            <w:tcW w:type="dxa" w:w="2077"/>
-          </w:tcPr>
-          <w:p>
-            <w:r>
-              <w:rPr>
-                <w:sz w:val="18"/>
-              </w:rPr>
-              <w:t>一次正式活动主持任务，含相应准备与现场履职；彩排和正式主持不拆次</w:t>
-            </w:r>
-          </w:p>
-        </w:tc>
-        <w:tc>
-          <w:tcPr>
-            <w:tcW w:type="dxa" w:w="2077"/>
-          </w:tcPr>
-          <w:p>
-            <w:r>
-              <w:rPr>
-                <w:sz w:val="18"/>
-              </w:rPr>
-              <w:t>个人全部岗位奖励统一累计6分</w:t>
-            </w:r>
-          </w:p>
-        </w:tc>
-      </w:tr>
-      <w:tr>
-        <w:trPr>
-          <w:cantSplit/>
-        </w:trPr>
-        <w:tc>
-          <w:tcPr>
-            <w:tcW w:type="dxa" w:w="2077"/>
-          </w:tcPr>
-          <w:p>
-            <w:r>
-              <w:rPr>
-                <w:sz w:val="18"/>
-              </w:rPr>
-              <w:t>礼仪队服务</w:t>
-            </w:r>
-          </w:p>
-        </w:tc>
-        <w:tc>
-          <w:tcPr>
-            <w:tcW w:type="dxa" w:w="2077"/>
-          </w:tcPr>
-          <w:p>
-            <w:r>
-              <w:rPr>
-                <w:sz w:val="18"/>
-              </w:rPr>
-              <w:t>1分/次；取消原工作人员操行分</w:t>
-            </w:r>
-          </w:p>
-        </w:tc>
-        <w:tc>
-          <w:tcPr>
-            <w:tcW w:type="dxa" w:w="2077"/>
-          </w:tcPr>
-          <w:p>
-            <w:r>
-              <w:rPr>
-                <w:sz w:val="18"/>
-              </w:rPr>
-              <w:t>一次正式活动服务班次；多日活动如何计次须提前备案</w:t>
-            </w:r>
-          </w:p>
-        </w:tc>
-        <w:tc>
-          <w:tcPr>
-            <w:tcW w:type="dxa" w:w="2077"/>
-          </w:tcPr>
-          <w:p>
-            <w:r>
-              <w:rPr>
-                <w:sz w:val="18"/>
-              </w:rPr>
-              <w:t>个人全部岗位奖励统一累计6分</w:t>
+            <w:tcW w:type="dxa" w:w="1662"/>
+          </w:tcPr>
+          <w:p>
+            <w:r>
+              <w:rPr>
+                <w:sz w:val="18"/>
+              </w:rPr>
+              <w:t>须承担实质筹备、组织或执行任务并通过验收；仅参加志愿服务不自动按承办人员计分</w:t>
+            </w:r>
+          </w:p>
+        </w:tc>
+        <w:tc>
+          <w:tcPr>
+            <w:tcW w:type="dxa" w:w="1662"/>
+          </w:tcPr>
+          <w:p>
+            <w:r>
+              <w:rPr>
+                <w:sz w:val="18"/>
+              </w:rPr>
+              <w:t>同上；不因兼任多个部门增加额度</w:t>
             </w:r>
           </w:p>
         </w:tc>
@@ -4232,7 +4163,7 @@
     </w:tbl>
     <w:p>
       <w:r>
-        <w:t>青志队自主承办志愿活动不自动进入学院重大活动名单。志愿时长与奖励分是否可同时登记应按学校制度，不一概允许或取消；同一工作不得重复计算奖励分。主持、礼仪被取消的是本次拟取消的工作人员操行项目，其他独立获评荣誉是否可计分另按学校规则。</w:t>
+        <w:t>青志队自主承办志愿活动不自动进入学院重大活动名单。志愿时长与奖励分是否可同时登记按学校制度处理。宣传部、学习部不再按本表申报一般办活动奖励分。</w:t>
       </w:r>
     </w:p>
     <w:p>
@@ -4240,7 +4171,250 @@
         <w:pStyle w:val="Heading1"/>
       </w:pPr>
       <w:r>
-        <w:t>九、统一申报、去重与复核程序（建议）</w:t>
+        <w:t>九、下属二级队伍奖励分表（第四表）</w:t>
+      </w:r>
+    </w:p>
+    <w:p>
+      <w:r>
+        <w:t>本表奖励分不受部门奖励分每学期6分上限限制，不占用前三表6分额度；同一人兼任部门岗位和二级队伍岗位时分别汇总。独立累计不等于同一工作可以重复申报。</w:t>
+      </w:r>
+    </w:p>
+    <w:tbl>
+      <w:tblPr>
+        <w:tblStyle w:val="TableGrid"/>
+        <w:tblW w:type="auto" w:w="0"/>
+        <w:tblLook w:firstColumn="1" w:firstRow="1" w:lastColumn="0" w:lastRow="0" w:noHBand="0" w:noVBand="1" w:val="04A0"/>
+      </w:tblPr>
+      <w:tblGrid>
+        <w:gridCol w:w="1662"/>
+        <w:gridCol w:w="1662"/>
+        <w:gridCol w:w="1662"/>
+        <w:gridCol w:w="1662"/>
+        <w:gridCol w:w="1662"/>
+      </w:tblGrid>
+      <w:tr>
+        <w:trPr>
+          <w:tblHeader/>
+          <w:cantSplit/>
+        </w:trPr>
+        <w:tc>
+          <w:tcPr>
+            <w:tcW w:type="dxa" w:w="1662"/>
+          </w:tcPr>
+          <w:p>
+            <w:r>
+              <w:rPr>
+                <w:sz w:val="18"/>
+              </w:rPr>
+              <w:t>二级队伍</w:t>
+            </w:r>
+          </w:p>
+        </w:tc>
+        <w:tc>
+          <w:tcPr>
+            <w:tcW w:type="dxa" w:w="1662"/>
+          </w:tcPr>
+          <w:p>
+            <w:r>
+              <w:rPr>
+                <w:sz w:val="18"/>
+              </w:rPr>
+              <w:t>工作事项</w:t>
+            </w:r>
+          </w:p>
+        </w:tc>
+        <w:tc>
+          <w:tcPr>
+            <w:tcW w:type="dxa" w:w="1662"/>
+          </w:tcPr>
+          <w:p>
+            <w:r>
+              <w:rPr>
+                <w:sz w:val="18"/>
+              </w:rPr>
+              <w:t>奖励分标准</w:t>
+            </w:r>
+          </w:p>
+        </w:tc>
+        <w:tc>
+          <w:tcPr>
+            <w:tcW w:type="dxa" w:w="1662"/>
+          </w:tcPr>
+          <w:p>
+            <w:r>
+              <w:rPr>
+                <w:sz w:val="18"/>
+              </w:rPr>
+              <w:t>认定条件</w:t>
+            </w:r>
+          </w:p>
+        </w:tc>
+        <w:tc>
+          <w:tcPr>
+            <w:tcW w:type="dxa" w:w="1662"/>
+          </w:tcPr>
+          <w:p>
+            <w:r>
+              <w:rPr>
+                <w:sz w:val="18"/>
+              </w:rPr>
+              <w:t>学期上限</w:t>
+            </w:r>
+          </w:p>
+        </w:tc>
+      </w:tr>
+      <w:tr>
+        <w:trPr>
+          <w:cantSplit/>
+        </w:trPr>
+        <w:tc>
+          <w:tcPr>
+            <w:tcW w:type="dxa" w:w="1662"/>
+          </w:tcPr>
+          <w:p>
+            <w:r>
+              <w:rPr>
+                <w:sz w:val="18"/>
+              </w:rPr>
+              <w:t>主持队</w:t>
+            </w:r>
+          </w:p>
+        </w:tc>
+        <w:tc>
+          <w:tcPr>
+            <w:tcW w:type="dxa" w:w="1662"/>
+          </w:tcPr>
+          <w:p>
+            <w:r>
+              <w:rPr>
+                <w:sz w:val="18"/>
+              </w:rPr>
+              <w:t>正式活动主持</w:t>
+            </w:r>
+          </w:p>
+        </w:tc>
+        <w:tc>
+          <w:tcPr>
+            <w:tcW w:type="dxa" w:w="1662"/>
+          </w:tcPr>
+          <w:p>
+            <w:r>
+              <w:rPr>
+                <w:sz w:val="18"/>
+              </w:rPr>
+              <w:t>3分/次</w:t>
+            </w:r>
+          </w:p>
+        </w:tc>
+        <w:tc>
+          <w:tcPr>
+            <w:tcW w:type="dxa" w:w="1662"/>
+          </w:tcPr>
+          <w:p>
+            <w:r>
+              <w:rPr>
+                <w:sz w:val="18"/>
+              </w:rPr>
+              <w:t>完成准备及正式主持，经负责人核验；彩排和正式主持不拆成两次；取消原每次工作人员操行加分</w:t>
+            </w:r>
+          </w:p>
+        </w:tc>
+        <w:tc>
+          <w:tcPr>
+            <w:tcW w:type="dxa" w:w="1662"/>
+          </w:tcPr>
+          <w:p>
+            <w:r>
+              <w:rPr>
+                <w:sz w:val="18"/>
+              </w:rPr>
+              <w:t>本细则不设奖励分上限，据实累计</w:t>
+            </w:r>
+          </w:p>
+        </w:tc>
+      </w:tr>
+      <w:tr>
+        <w:trPr>
+          <w:cantSplit/>
+        </w:trPr>
+        <w:tc>
+          <w:tcPr>
+            <w:tcW w:type="dxa" w:w="1662"/>
+          </w:tcPr>
+          <w:p>
+            <w:r>
+              <w:rPr>
+                <w:sz w:val="18"/>
+              </w:rPr>
+              <w:t>礼仪队</w:t>
+            </w:r>
+          </w:p>
+        </w:tc>
+        <w:tc>
+          <w:tcPr>
+            <w:tcW w:type="dxa" w:w="1662"/>
+          </w:tcPr>
+          <w:p>
+            <w:r>
+              <w:rPr>
+                <w:sz w:val="18"/>
+              </w:rPr>
+              <w:t>正式活动礼仪服务</w:t>
+            </w:r>
+          </w:p>
+        </w:tc>
+        <w:tc>
+          <w:tcPr>
+            <w:tcW w:type="dxa" w:w="1662"/>
+          </w:tcPr>
+          <w:p>
+            <w:r>
+              <w:rPr>
+                <w:sz w:val="18"/>
+              </w:rPr>
+              <w:t>1分/次</w:t>
+            </w:r>
+          </w:p>
+        </w:tc>
+        <w:tc>
+          <w:tcPr>
+            <w:tcW w:type="dxa" w:w="1662"/>
+          </w:tcPr>
+          <w:p>
+            <w:r>
+              <w:rPr>
+                <w:sz w:val="18"/>
+              </w:rPr>
+              <w:t>完成正式服务，经负责人核验；多日活动的计次方式应事先明确；取消原每次工作人员操行加分</w:t>
+            </w:r>
+          </w:p>
+        </w:tc>
+        <w:tc>
+          <w:tcPr>
+            <w:tcW w:type="dxa" w:w="1662"/>
+          </w:tcPr>
+          <w:p>
+            <w:r>
+              <w:rPr>
+                <w:sz w:val="18"/>
+              </w:rPr>
+              <w:t>本细则不设奖励分上限，据实累计</w:t>
+            </w:r>
+          </w:p>
+        </w:tc>
+      </w:tr>
+    </w:tbl>
+    <w:p>
+      <w:r>
+        <w:t>现已明确的二级队伍为主持队、礼仪队；新增队伍须另行明确计分事项和标准，不自动套用主持或礼仪分值。取消的是原工作人员操行项目，独立获评荣誉的适用规则按学校规定执行。岗位奖励项目是否可录入学校综测仍须核准。</w:t>
+      </w:r>
+    </w:p>
+    <w:p>
+      <w:pPr>
+        <w:pStyle w:val="Heading1"/>
+      </w:pPr>
+      <w:r>
+        <w:t>十、统一申报、去重与复核程序（建议）</w:t>
       </w:r>
     </w:p>
     <w:p>
@@ -4367,7 +4541,7 @@
               <w:rPr>
                 <w:sz w:val="18"/>
               </w:rPr>
-              <w:t>全部岗位性奖励合并适用个人6分统一上限；超额记录可留作履职证明，不转移给他人或跨学期补报</w:t>
+              <w:t>前三表部门岗位奖励合并适用个人学期6分上限；第四表二级队伍奖励单独据实累计，不设本细则上限；同一工作不在两类重复计算，超额部门奖励不转作二级队伍奖励或跨学期补报</w:t>
             </w:r>
           </w:p>
         </w:tc>
@@ -4471,7 +4645,7 @@
         <w:pStyle w:val="Heading1"/>
       </w:pPr>
       <w:r>
-        <w:t>十、核算示例（仅演示拟议标准）</w:t>
+        <w:t>十一、核算示例（仅演示拟议标准）</w:t>
       </w:r>
     </w:p>
     <w:tbl>
@@ -4719,7 +4893,7 @@
               <w:rPr>
                 <w:sz w:val="18"/>
               </w:rPr>
-              <w:t>同一人主持2次另做礼仪1次</w:t>
+              <w:t>部门奖励已达6分，另主持2次、礼仪1次</w:t>
             </w:r>
           </w:p>
         </w:tc>
@@ -4732,7 +4906,7 @@
               <w:rPr>
                 <w:sz w:val="18"/>
               </w:rPr>
-              <w:t>3×2＋1＝7分，按统一个人累计上限计6分</w:t>
+              <w:t>二级队伍奖励3×2＋1＝7分；加部门奖励6分，总计13奖励分</w:t>
             </w:r>
           </w:p>
         </w:tc>
@@ -4745,7 +4919,7 @@
               <w:rPr>
                 <w:sz w:val="18"/>
               </w:rPr>
-              <w:t>主持与礼仪跨岗位合并累计</w:t>
+              <w:t>主持与礼仪按二级队伍规则据实累计</w:t>
             </w:r>
           </w:p>
         </w:tc>
@@ -4756,7 +4930,7 @@
         <w:pStyle w:val="Heading1"/>
       </w:pPr>
       <w:r>
-        <w:t>十一、提交老师确认的事项清单</w:t>
+        <w:t>十二、提交老师确认的事项清单</w:t>
       </w:r>
     </w:p>
     <w:p>
@@ -4791,7 +4965,7 @@
     </w:p>
     <w:p>
       <w:r>
-        <w:t>□ 本细则个人奖励分统一6分上限已覆盖全部下属队伍与兼任岗位，不分部门职务；需确认与学校其他奖励项目的衔接和跨类别累计规则。</w:t>
+        <w:t>□ 前三表部门奖励每人每学期合并最多6分，不分部门职务；第四表二级队伍奖励独立据实累计、不受6分上限限制。需核准学校录入口径及与其他奖励项目的衔接。</w:t>
       </w:r>
     </w:p>
     <w:p>
@@ -4968,7 +5142,7 @@
               <w:rPr>
                 <w:sz w:val="18"/>
               </w:rPr>
-              <w:t>人员内部标识、分项类别、计分依据、去重结果、原始合计、上限后分值、已报批次、审核及复核结果</w:t>
+              <w:t>人员内部标识、分项类别、计分依据、去重结果、原始合计、部门奖励上限后分值、二级队伍据实累计分值、已报批次、审核及复核结果</w:t>
             </w:r>
           </w:p>
         </w:tc>

</xml_diff>